<commit_message>
docs: regenerate the 4 Word docs from the reviewed content, drop the .md copies
Content now comes word-for-word from a reviewed draft rather than the
prior generator's own prose, converted straight from source (a small
generic Markdown -> docx renderer against the existing docx helpers) so
formatting stays exact without hand-retyping. Removes docs/*.md, which
were a redundant format of the same four docs and are not being kept
alongside the Word versions.
</commit_message>
<xml_diff>
--- a/docs/Pepiros - 01 - Project Overview.docx
+++ b/docs/Pepiros - 01 - Project Overview.docx
@@ -80,7 +80,7 @@
           <w:sz w:val="20"/>
           <w:szCs w:val="20"/>
         </w:rPr>
-        <w:t xml:space="preserve">0.1.1</w:t>
+        <w:t xml:space="preserve">Unreleased (post-0.1.1)</w:t>
       </w:r>
     </w:p>
     <w:p>
@@ -653,26 +653,7 @@
           <w:sz w:val="22"/>
           <w:szCs w:val="22"/>
         </w:rPr>
-        <w:t xml:space="preserve">Upload a PDF, or paste an arXiv / PMC / DOI link. The pipeline extracts sections, chunks, figures, equations, references, and numeric statistics, then classifies the paper's archetype (RCT, cohort study, systematic review, and seven others) and drafts a set of thematic "pillars" with claims underneath each.</w:t>
-      </w:r>
-    </w:p>
-    <w:p>
-      <w:pPr>
-        <w:pStyle w:val="ListParagraph"/>
-        <w:numPr>
-          <w:ilvl w:val="0"/>
-          <w:numId w:val="1"/>
-        </w:numPr>
-        <w:spacing w:after="100" w:line="280"/>
-      </w:pPr>
-      <w:r>
-        <w:rPr>
-          <w:rFonts w:ascii="Georgia" w:cs="Georgia" w:eastAsia="Georgia" w:hAnsi="Georgia"/>
-          <w:color w:val="5C564A"/>
-          <w:sz w:val="22"/>
-          <w:szCs w:val="22"/>
-        </w:rPr>
-        <w:t xml:space="preserve">Every generated claim's citation is deterministically re-verified against the source before it becomes a real evidence row -- the grounding spine never trusts a model's own assertion, including a claim submitted through the MCP </w:t>
+        <w:t xml:space="preserve">Upload a PDF, or paste an arXiv / PMC / DOI link. The pipeline extracts sections, chunks, figures, equations, references, and numeric statistics, then classifies the paper's archetype (RCT, cohort study, systematic review, and six others) and drafts a set of thematic "pillars" with claims underneath each. This parsing step shells out to a local Python process, so it only runs against </w:t>
       </w:r>
       <w:r>
         <w:rPr>
@@ -681,6 +662,43 @@
           <w:sz w:val="20"/>
           <w:szCs w:val="20"/>
         </w:rPr>
+        <w:t xml:space="preserve">npm run dev</w:t>
+      </w:r>
+      <w:r>
+        <w:rPr>
+          <w:rFonts w:ascii="Georgia" w:cs="Georgia" w:eastAsia="Georgia" w:hAnsi="Georgia"/>
+          <w:color w:val="5C564A"/>
+          <w:sz w:val="22"/>
+          <w:szCs w:val="22"/>
+        </w:rPr>
+        <w:t xml:space="preserve"> on a real machine right now -- the hosted deployment can read and serve an already-ingested paper, but can't parse a newly uploaded one until that piece moves off Vercel's Node runtime.</w:t>
+      </w:r>
+    </w:p>
+    <w:p>
+      <w:pPr>
+        <w:pStyle w:val="ListParagraph"/>
+        <w:numPr>
+          <w:ilvl w:val="0"/>
+          <w:numId w:val="1"/>
+        </w:numPr>
+        <w:spacing w:after="100" w:line="280"/>
+      </w:pPr>
+      <w:r>
+        <w:rPr>
+          <w:rFonts w:ascii="Georgia" w:cs="Georgia" w:eastAsia="Georgia" w:hAnsi="Georgia"/>
+          <w:color w:val="5C564A"/>
+          <w:sz w:val="22"/>
+          <w:szCs w:val="22"/>
+        </w:rPr>
+        <w:t xml:space="preserve">Every generated claim's citation is deterministically re-verified against the source before it becomes a real evidence row -- the grounding spine never trusts a model's own assertion, including a claim submitted through the MCP </w:t>
+      </w:r>
+      <w:r>
+        <w:rPr>
+          <w:rFonts w:ascii="Consolas" w:cs="Consolas" w:eastAsia="Consolas" w:hAnsi="Consolas"/>
+          <w:color w:val="553780"/>
+          <w:sz w:val="20"/>
+          <w:szCs w:val="20"/>
+        </w:rPr>
         <w:t xml:space="preserve">create_node</w:t>
       </w:r>
       <w:r>
@@ -1042,7 +1060,7 @@
           <w:sz w:val="22"/>
           <w:szCs w:val="22"/>
         </w:rPr>
-        <w:t xml:space="preserve">This is an early-stage, two-person build that moves fast; the project's own README and status page maintain a running, honest "working / partly built / not built yet" breakdown rather than presenting every surface as finished. As of this writing the deterministic grounding spine, the reader and canvas UI, the MCP server (both stdio and remote transports), grounded chat, and account/session handling are all real and tested. Remaining gaps -- OCR for scanned PDFs, two synthesis node types that need signals nothing in the pipeline extracts yet, and session refresh -- are each documented at the top of the file they belong in, not hidden.</w:t>
+        <w:t xml:space="preserve">This is an early-stage, two-person build that moves fast; the project's own README and status page maintain a running, honest "working / partly built / not built yet" breakdown rather than presenting every surface as finished. As of this writing the deterministic grounding spine, the reader and canvas UI, the MCP server (both stdio and remote transports), grounded chat, and account/session handling are all real and tested, and run against a real Postgres backend rather than the bundled fixture. Remaining gaps -- OCR for scanned PDFs (still a stub, not wired to anything yet), two synthesis node types that need signals nothing in the pipeline extracts yet, hosted PDF parsing, and session refresh -- are each documented at the top of the file they belong in, not hidden.</w:t>
       </w:r>
     </w:p>
     <w:p>
@@ -1110,8 +1128,8 @@
         </w:tblBorders>
       </w:tblPr>
       <w:tblGrid>
-        <w:gridCol w:w="3200"/>
-        <w:gridCol w:w="5600"/>
+        <w:gridCol w:w="100"/>
+        <w:gridCol w:w="100"/>
       </w:tblGrid>
       <w:tr>
         <w:trPr>

</xml_diff>